<commit_message>
Add portfolio URL to resume
</commit_message>
<xml_diff>
--- a/docs/Dilep_Kumar_K_Resume.docx
+++ b/docs/Dilep_Kumar_K_Resume.docx
@@ -82,6 +82,21 @@
             <w:u w:val="single"/>
           </w:rPr>
           <w:t>GitHub</w:t>
+        </w:r>
+      </w:hyperlink>
+      <w:r>
+        <w:rPr>
+          <w:sz w:val="19"/>
+        </w:rPr>
+        <w:t xml:space="preserve"> | </w:t>
+      </w:r>
+      <w:hyperlink r:id="rId14">
+        <w:r>
+          <w:rPr>
+            <w:color w:val="0563C1"/>
+            <w:u w:val="single"/>
+          </w:rPr>
+          <w:t>Portfolio</w:t>
         </w:r>
       </w:hyperlink>
     </w:p>

</xml_diff>

<commit_message>
Add industrial vision project to portfolio and resume
</commit_message>
<xml_diff>
--- a/docs/Dilep_Kumar_K_Resume.docx
+++ b/docs/Dilep_Kumar_K_Resume.docx
@@ -132,11 +132,7 @@
         <w:spacing w:after="60"/>
       </w:pPr>
       <w:r>
-        <w:rPr>
-          <w:rFonts w:eastAsia="Arial"/>
-          <w:sz w:val="21"/>
-        </w:rPr>
-        <w:t>Data Science and AI learner with hands-on experience building end-to-end machine learning projects for credit risk and transaction fraud detection. Former Testing Trainee with experience in SAP/CPI validation, production reporting, and defect resolution. Seeking an entry-level Data Scientist or Machine Learning role focused on reliable, explainable models.</w:t>
+        <w:t>Data Science and AI learner with hands-on experience building end-to-end machine learning projects for credit risk, transaction fraud detection, and industrial visual inspection. Former Testing Trainee with experience in SAP/CPI validation, production reporting, and defect resolution. Seeking an entry-level Data Scientist or Machine Learning role focused on reliable, explainable models.</w:t>
       </w:r>
     </w:p>
     <w:p>
@@ -210,17 +206,12 @@
       </w:pPr>
       <w:r>
         <w:rPr>
-          <w:rFonts w:eastAsia="Arial"/>
           <w:b/>
-          <w:sz w:val="22"/>
         </w:rPr>
-        <w:t xml:space="preserve">Machine Learning: </w:t>
+        <w:t xml:space="preserve">Machine Learning &amp; Vision: </w:t>
       </w:r>
       <w:r>
-        <w:rPr>
-          <w:rFonts w:eastAsia="Arial"/>
-        </w:rPr>
-        <w:t>scikit-learn, XGBoost, LightGBM, Feature Engineering, Model Evaluation</w:t>
+        <w:t>PyTorch, OpenCV, scikit-learn, XGBoost, LightGBM, Feature Engineering, Model Evaluation</w:t>
       </w:r>
     </w:p>
     <w:p>
@@ -446,6 +437,91 @@
     <w:p>
       <w:pPr>
         <w:keepNext/>
+        <w:keepLines/>
+        <w:spacing w:before="60" w:after="20"/>
+      </w:pPr>
+      <w:r>
+        <w:rPr>
+          <w:b/>
+          <w:sz w:val="23"/>
+        </w:rPr>
+        <w:t xml:space="preserve">Industrial Visual Defect Intelligence Platform | </w:t>
+      </w:r>
+      <w:hyperlink r:id="rId15">
+        <w:r>
+          <w:rPr>
+            <w:color w:val="0563C1"/>
+            <w:u w:val="single"/>
+            <w:b/>
+            <w:sz w:val="23"/>
+          </w:rPr>
+          <w:t>GitHub repository</w:t>
+        </w:r>
+      </w:hyperlink>
+    </w:p>
+    <w:p>
+      <w:pPr>
+        <w:keepNext/>
+        <w:keepLines/>
+        <w:spacing w:after="30"/>
+      </w:pPr>
+      <w:r>
+        <w:rPr>
+          <w:b/>
+          <w:i/>
+          <w:sz w:val="19"/>
+        </w:rPr>
+        <w:t xml:space="preserve">Technologies: </w:t>
+      </w:r>
+      <w:r>
+        <w:rPr>
+          <w:i/>
+          <w:sz w:val="19"/>
+        </w:rPr>
+        <w:t>PyTorch, OpenCV, PatchCore, U-Net, FastAPI, React, MLflow, Docker, pytest</w:t>
+      </w:r>
+    </w:p>
+    <w:p>
+      <w:pPr>
+        <w:keepNext/>
+        <w:keepLines/>
+        <w:numPr>
+          <w:ilvl w:val="0"/>
+          <w:numId w:val="1"/>
+        </w:numPr>
+        <w:spacing w:after="30"/>
+      </w:pPr>
+      <w:r>
+        <w:t>Built an industrial inspection platform combining PatchCore-Lite anomaly localization with multi-task U-Net segmentation for known defects.</w:t>
+      </w:r>
+    </w:p>
+    <w:p>
+      <w:pPr>
+        <w:keepNext/>
+        <w:keepLines/>
+        <w:numPr>
+          <w:ilvl w:val="0"/>
+          <w:numId w:val="1"/>
+        </w:numPr>
+        <w:spacing w:after="30"/>
+      </w:pPr>
+      <w:r>
+        <w:t>Implemented image-quality gates, severity and reason codes, PASS/REJECT/MANUAL_REVIEW decisions, FastAPI workflows, monitoring, and 48 automated tests.</w:t>
+      </w:r>
+    </w:p>
+    <w:p>
+      <w:pPr>
+        <w:rPr>
+          <w:rFonts w:eastAsia="Arial"/>
+          <w:b/>
+          <w:sz w:val="23"/>
+        </w:rPr>
+      </w:pPr>
+    </w:p>
+    <w:p>
+      <w:pPr>
+        <w:keepNext/>
+        <w:keepLines/>
         <w:spacing w:before="60" w:after="20"/>
       </w:pPr>
       <w:r>
@@ -472,6 +548,7 @@
     <w:p>
       <w:pPr>
         <w:keepNext/>
+        <w:keepLines/>
         <w:spacing w:after="30"/>
       </w:pPr>
       <w:r>
@@ -495,6 +572,7 @@
     <w:p>
       <w:pPr>
         <w:keepNext/>
+        <w:keepLines/>
         <w:numPr>
           <w:ilvl w:val="0"/>
           <w:numId w:val="1"/>
@@ -511,6 +589,7 @@
     <w:p>
       <w:pPr>
         <w:keepNext/>
+        <w:keepLines/>
         <w:numPr>
           <w:ilvl w:val="0"/>
           <w:numId w:val="1"/>
@@ -526,6 +605,7 @@
     </w:p>
     <w:p>
       <w:pPr>
+        <w:keepLines/>
         <w:numPr>
           <w:ilvl w:val="0"/>
           <w:numId w:val="1"/>
@@ -549,6 +629,10 @@
       </w:pPr>
     </w:p>
     <w:p>
+      <w:pPr>
+        <w:keepNext/>
+        <w:keepLines/>
+      </w:pPr>
       <w:r>
         <w:rPr>
           <w:rFonts w:eastAsia="Arial"/>
@@ -573,6 +657,7 @@
     <w:p>
       <w:pPr>
         <w:keepNext/>
+        <w:keepLines/>
         <w:spacing w:after="30"/>
       </w:pPr>
       <w:r>
@@ -596,6 +681,7 @@
     <w:p>
       <w:pPr>
         <w:keepNext/>
+        <w:keepLines/>
         <w:numPr>
           <w:ilvl w:val="0"/>
           <w:numId w:val="1"/>
@@ -612,6 +698,7 @@
     <w:p>
       <w:pPr>
         <w:keepNext/>
+        <w:keepLines/>
         <w:numPr>
           <w:ilvl w:val="0"/>
           <w:numId w:val="1"/>
@@ -627,6 +714,7 @@
     </w:p>
     <w:p>
       <w:pPr>
+        <w:keepLines/>
         <w:numPr>
           <w:ilvl w:val="0"/>
           <w:numId w:val="1"/>
@@ -643,6 +731,7 @@
     <w:p>
       <w:pPr>
         <w:keepNext/>
+        <w:keepLines/>
         <w:spacing w:before="60" w:after="20"/>
       </w:pPr>
       <w:r>
@@ -670,6 +759,7 @@
     <w:p>
       <w:pPr>
         <w:keepNext/>
+        <w:keepLines/>
         <w:spacing w:after="30"/>
       </w:pPr>
       <w:r>
@@ -693,6 +783,7 @@
     <w:p>
       <w:pPr>
         <w:keepNext/>
+        <w:keepLines/>
         <w:numPr>
           <w:ilvl w:val="0"/>
           <w:numId w:val="1"/>
@@ -708,6 +799,7 @@
     </w:p>
     <w:p>
       <w:pPr>
+        <w:keepLines/>
         <w:numPr>
           <w:ilvl w:val="0"/>
           <w:numId w:val="1"/>

</xml_diff>

<commit_message>
Update portfolio with cinematic design and optimized animations
</commit_message>
<xml_diff>
--- a/docs/Dilep_Kumar_K_Resume.docx
+++ b/docs/Dilep_Kumar_K_Resume.docx
@@ -90,7 +90,7 @@
         </w:rPr>
         <w:t xml:space="preserve"> | </w:t>
       </w:r>
-      <w:hyperlink r:id="rId14">
+      <w:hyperlink r:id="rId9">
         <w:r>
           <w:rPr>
             <w:color w:val="0563C1"/>
@@ -132,11 +132,7 @@
         <w:spacing w:after="60"/>
       </w:pPr>
       <w:r>
-        <w:rPr>
-          <w:rFonts w:eastAsia="Arial"/>
-          <w:sz w:val="21"/>
-        </w:rPr>
-        <w:t>Data Science and AI learner with hands-on experience building end-to-end machine learning projects for credit risk and transaction fraud detection. Former Testing Trainee with experience in SAP/CPI validation, production reporting, and defect resolution. Seeking an entry-level Data Scientist or Machine Learning role focused on reliable, explainable models.</w:t>
+        <w:t>Data Science and AI learner with hands-on experience building end-to-end machine learning projects for credit risk, transaction fraud detection, and industrial visual inspection. Former Testing Trainee with experience in SAP/CPI validation, production reporting, and defect resolution. Seeking an entry-level Data Scientist or Machine Learning role focused on reliable, explainable models.</w:t>
       </w:r>
     </w:p>
     <w:p>
@@ -201,7 +197,56 @@
         <w:rPr>
           <w:rFonts w:eastAsia="Arial"/>
         </w:rPr>
-        <w:t>pandas, NumPy, Jupyter, Matplotlib, Seaborn</w:t>
+        <w:t xml:space="preserve">pandas, NumPy, </w:t>
+      </w:r>
+      <w:proofErr w:type="spellStart"/>
+      <w:r>
+        <w:rPr>
+          <w:rFonts w:eastAsia="Arial"/>
+        </w:rPr>
+        <w:t>Jupyter</w:t>
+      </w:r>
+      <w:proofErr w:type="spellEnd"/>
+      <w:r>
+        <w:rPr>
+          <w:rFonts w:eastAsia="Arial"/>
+        </w:rPr>
+        <w:t>, Matplotlib, Seaborn</w:t>
+      </w:r>
+    </w:p>
+    <w:p>
+      <w:pPr>
+        <w:spacing w:after="20"/>
+      </w:pPr>
+      <w:r>
+        <w:rPr>
+          <w:b/>
+        </w:rPr>
+        <w:t xml:space="preserve">Machine Learning &amp; Vision: </w:t>
+      </w:r>
+      <w:proofErr w:type="spellStart"/>
+      <w:r>
+        <w:t>PyTorch</w:t>
+      </w:r>
+      <w:proofErr w:type="spellEnd"/>
+      <w:r>
+        <w:t xml:space="preserve">, OpenCV, scikit-learn, </w:t>
+      </w:r>
+      <w:proofErr w:type="spellStart"/>
+      <w:r>
+        <w:t>XGBoost</w:t>
+      </w:r>
+      <w:proofErr w:type="spellEnd"/>
+      <w:r>
+        <w:t xml:space="preserve">, </w:t>
+      </w:r>
+      <w:proofErr w:type="spellStart"/>
+      <w:r>
+        <w:t>LightGBM</w:t>
+      </w:r>
+      <w:proofErr w:type="spellEnd"/>
+      <w:r>
+        <w:t>, Feature Engineering, Model Evaluation</w:t>
       </w:r>
     </w:p>
     <w:p>
@@ -214,33 +259,54 @@
           <w:b/>
           <w:sz w:val="22"/>
         </w:rPr>
-        <w:t xml:space="preserve">Machine Learning: </w:t>
+        <w:t xml:space="preserve">Explainability &amp; </w:t>
       </w:r>
-      <w:r>
-        <w:rPr>
-          <w:rFonts w:eastAsia="Arial"/>
-        </w:rPr>
-        <w:t>scikit-learn, XGBoost, LightGBM, Feature Engineering, Model Evaluation</w:t>
-      </w:r>
-    </w:p>
-    <w:p>
-      <w:pPr>
-        <w:spacing w:after="20"/>
-      </w:pPr>
+      <w:proofErr w:type="spellStart"/>
       <w:r>
         <w:rPr>
           <w:rFonts w:eastAsia="Arial"/>
           <w:b/>
           <w:sz w:val="22"/>
         </w:rPr>
-        <w:t xml:space="preserve">Explainability &amp; MLOps: </w:t>
+        <w:t>MLOps</w:t>
+      </w:r>
+      <w:proofErr w:type="spellEnd"/>
+      <w:r>
+        <w:rPr>
+          <w:rFonts w:eastAsia="Arial"/>
+          <w:b/>
+          <w:sz w:val="22"/>
+        </w:rPr>
+        <w:t xml:space="preserve">: </w:t>
       </w:r>
       <w:r>
         <w:rPr>
           <w:rFonts w:eastAsia="Arial"/>
         </w:rPr>
-        <w:t>SHAP, MLflow, Optuna</w:t>
+        <w:t xml:space="preserve">SHAP, </w:t>
       </w:r>
+      <w:proofErr w:type="spellStart"/>
+      <w:r>
+        <w:rPr>
+          <w:rFonts w:eastAsia="Arial"/>
+        </w:rPr>
+        <w:t>MLflow</w:t>
+      </w:r>
+      <w:proofErr w:type="spellEnd"/>
+      <w:r>
+        <w:rPr>
+          <w:rFonts w:eastAsia="Arial"/>
+        </w:rPr>
+        <w:t xml:space="preserve">, </w:t>
+      </w:r>
+      <w:proofErr w:type="spellStart"/>
+      <w:r>
+        <w:rPr>
+          <w:rFonts w:eastAsia="Arial"/>
+        </w:rPr>
+        <w:t>Optuna</w:t>
+      </w:r>
+      <w:proofErr w:type="spellEnd"/>
     </w:p>
     <w:p>
       <w:pPr>
@@ -254,12 +320,42 @@
         </w:rPr>
         <w:t xml:space="preserve">Deployment &amp; Tools: </w:t>
       </w:r>
+      <w:proofErr w:type="spellStart"/>
       <w:r>
         <w:rPr>
           <w:rFonts w:eastAsia="Arial"/>
         </w:rPr>
-        <w:t>FastAPI, Streamlit, Docker, Git, pytest</w:t>
+        <w:t>FastAPI</w:t>
       </w:r>
+      <w:proofErr w:type="spellEnd"/>
+      <w:r>
+        <w:rPr>
+          <w:rFonts w:eastAsia="Arial"/>
+        </w:rPr>
+        <w:t xml:space="preserve">, </w:t>
+      </w:r>
+      <w:proofErr w:type="spellStart"/>
+      <w:r>
+        <w:rPr>
+          <w:rFonts w:eastAsia="Arial"/>
+        </w:rPr>
+        <w:t>Streamlit</w:t>
+      </w:r>
+      <w:proofErr w:type="spellEnd"/>
+      <w:r>
+        <w:rPr>
+          <w:rFonts w:eastAsia="Arial"/>
+        </w:rPr>
+        <w:t xml:space="preserve">, Docker, Git, </w:t>
+      </w:r>
+      <w:proofErr w:type="spellStart"/>
+      <w:r>
+        <w:rPr>
+          <w:rFonts w:eastAsia="Arial"/>
+        </w:rPr>
+        <w:t>pytest</w:t>
+      </w:r>
+      <w:proofErr w:type="spellEnd"/>
     </w:p>
     <w:p>
       <w:pPr>
@@ -368,7 +464,21 @@
         <w:rPr>
           <w:rFonts w:eastAsia="Arial"/>
         </w:rPr>
-        <w:t>Tested 30+ CPI iFlows and supported validation across 8 production releases.</w:t>
+        <w:t xml:space="preserve">Tested 30+ CPI </w:t>
+      </w:r>
+      <w:proofErr w:type="spellStart"/>
+      <w:r>
+        <w:rPr>
+          <w:rFonts w:eastAsia="Arial"/>
+        </w:rPr>
+        <w:t>iFlows</w:t>
+      </w:r>
+      <w:proofErr w:type="spellEnd"/>
+      <w:r>
+        <w:rPr>
+          <w:rFonts w:eastAsia="Arial"/>
+        </w:rPr>
+        <w:t xml:space="preserve"> and supported validation across 8 production releases.</w:t>
       </w:r>
     </w:p>
     <w:p>
@@ -446,6 +556,173 @@
     <w:p>
       <w:pPr>
         <w:keepNext/>
+        <w:keepLines/>
+        <w:spacing w:before="60" w:after="20"/>
+      </w:pPr>
+      <w:r>
+        <w:rPr>
+          <w:b/>
+          <w:sz w:val="23"/>
+        </w:rPr>
+        <w:t xml:space="preserve">Industrial Visual Defect Intelligence Platform | </w:t>
+      </w:r>
+      <w:hyperlink r:id="rId10">
+        <w:r>
+          <w:rPr>
+            <w:b/>
+            <w:color w:val="0563C1"/>
+            <w:sz w:val="23"/>
+            <w:u w:val="single"/>
+          </w:rPr>
+          <w:t>GitHub repository</w:t>
+        </w:r>
+      </w:hyperlink>
+    </w:p>
+    <w:p>
+      <w:pPr>
+        <w:keepNext/>
+        <w:keepLines/>
+        <w:spacing w:after="30"/>
+      </w:pPr>
+      <w:r>
+        <w:rPr>
+          <w:b/>
+          <w:i/>
+          <w:sz w:val="19"/>
+        </w:rPr>
+        <w:t xml:space="preserve">Technologies: </w:t>
+      </w:r>
+      <w:proofErr w:type="spellStart"/>
+      <w:r>
+        <w:rPr>
+          <w:i/>
+          <w:sz w:val="19"/>
+        </w:rPr>
+        <w:t>PyTorch</w:t>
+      </w:r>
+      <w:proofErr w:type="spellEnd"/>
+      <w:r>
+        <w:rPr>
+          <w:i/>
+          <w:sz w:val="19"/>
+        </w:rPr>
+        <w:t xml:space="preserve">, OpenCV, </w:t>
+      </w:r>
+      <w:proofErr w:type="spellStart"/>
+      <w:r>
+        <w:rPr>
+          <w:i/>
+          <w:sz w:val="19"/>
+        </w:rPr>
+        <w:t>PatchCore</w:t>
+      </w:r>
+      <w:proofErr w:type="spellEnd"/>
+      <w:r>
+        <w:rPr>
+          <w:i/>
+          <w:sz w:val="19"/>
+        </w:rPr>
+        <w:t xml:space="preserve">, U-Net, </w:t>
+      </w:r>
+      <w:proofErr w:type="spellStart"/>
+      <w:r>
+        <w:rPr>
+          <w:i/>
+          <w:sz w:val="19"/>
+        </w:rPr>
+        <w:t>FastAPI</w:t>
+      </w:r>
+      <w:proofErr w:type="spellEnd"/>
+      <w:r>
+        <w:rPr>
+          <w:i/>
+          <w:sz w:val="19"/>
+        </w:rPr>
+        <w:t xml:space="preserve">, React, </w:t>
+      </w:r>
+      <w:proofErr w:type="spellStart"/>
+      <w:r>
+        <w:rPr>
+          <w:i/>
+          <w:sz w:val="19"/>
+        </w:rPr>
+        <w:t>MLflow</w:t>
+      </w:r>
+      <w:proofErr w:type="spellEnd"/>
+      <w:r>
+        <w:rPr>
+          <w:i/>
+          <w:sz w:val="19"/>
+        </w:rPr>
+        <w:t xml:space="preserve">, Docker, </w:t>
+      </w:r>
+      <w:proofErr w:type="spellStart"/>
+      <w:r>
+        <w:rPr>
+          <w:i/>
+          <w:sz w:val="19"/>
+        </w:rPr>
+        <w:t>pytest</w:t>
+      </w:r>
+      <w:proofErr w:type="spellEnd"/>
+    </w:p>
+    <w:p>
+      <w:pPr>
+        <w:keepNext/>
+        <w:keepLines/>
+        <w:numPr>
+          <w:ilvl w:val="0"/>
+          <w:numId w:val="1"/>
+        </w:numPr>
+        <w:spacing w:after="30"/>
+      </w:pPr>
+      <w:r>
+        <w:t xml:space="preserve">Built an industrial inspection platform combining </w:t>
+      </w:r>
+      <w:proofErr w:type="spellStart"/>
+      <w:r>
+        <w:t>PatchCore</w:t>
+      </w:r>
+      <w:proofErr w:type="spellEnd"/>
+      <w:r>
+        <w:t>-Lite anomaly localization with multi-task U-Net segmentation for known defects.</w:t>
+      </w:r>
+    </w:p>
+    <w:p>
+      <w:pPr>
+        <w:keepNext/>
+        <w:keepLines/>
+        <w:numPr>
+          <w:ilvl w:val="0"/>
+          <w:numId w:val="1"/>
+        </w:numPr>
+        <w:spacing w:after="30"/>
+      </w:pPr>
+      <w:r>
+        <w:t xml:space="preserve">Implemented image-quality gates, severity and reason codes, PASS/REJECT/MANUAL_REVIEW decisions, </w:t>
+      </w:r>
+      <w:proofErr w:type="spellStart"/>
+      <w:r>
+        <w:t>FastAPI</w:t>
+      </w:r>
+      <w:proofErr w:type="spellEnd"/>
+      <w:r>
+        <w:t xml:space="preserve"> workflows, monitoring, and 48 automated tests.</w:t>
+      </w:r>
+    </w:p>
+    <w:p>
+      <w:pPr>
+        <w:rPr>
+          <w:rFonts w:eastAsia="Arial"/>
+          <w:b/>
+          <w:sz w:val="23"/>
+        </w:rPr>
+      </w:pPr>
+    </w:p>
+    <w:p>
+      <w:pPr>
+        <w:keepNext/>
+        <w:keepLines/>
         <w:spacing w:before="60" w:after="20"/>
       </w:pPr>
       <w:r>
@@ -456,7 +733,7 @@
         </w:rPr>
         <w:t xml:space="preserve">Explainable Credit Risk Engine | </w:t>
       </w:r>
-      <w:hyperlink r:id="rId9">
+      <w:hyperlink r:id="rId11">
         <w:r>
           <w:rPr>
             <w:rFonts w:eastAsia="Arial"/>
@@ -472,6 +749,7 @@
     <w:p>
       <w:pPr>
         <w:keepNext/>
+        <w:keepLines/>
         <w:spacing w:after="30"/>
       </w:pPr>
       <w:r>
@@ -489,12 +767,59 @@
           <w:i/>
           <w:sz w:val="19"/>
         </w:rPr>
-        <w:t>Python, scikit-learn, LightGBM, SHAP, Optuna, FastAPI</w:t>
+        <w:t xml:space="preserve">Python, scikit-learn, </w:t>
       </w:r>
+      <w:proofErr w:type="spellStart"/>
+      <w:r>
+        <w:rPr>
+          <w:rFonts w:eastAsia="Arial"/>
+          <w:i/>
+          <w:sz w:val="19"/>
+        </w:rPr>
+        <w:t>LightGBM</w:t>
+      </w:r>
+      <w:proofErr w:type="spellEnd"/>
+      <w:r>
+        <w:rPr>
+          <w:rFonts w:eastAsia="Arial"/>
+          <w:i/>
+          <w:sz w:val="19"/>
+        </w:rPr>
+        <w:t xml:space="preserve">, SHAP, </w:t>
+      </w:r>
+      <w:proofErr w:type="spellStart"/>
+      <w:r>
+        <w:rPr>
+          <w:rFonts w:eastAsia="Arial"/>
+          <w:i/>
+          <w:sz w:val="19"/>
+        </w:rPr>
+        <w:t>Optuna</w:t>
+      </w:r>
+      <w:proofErr w:type="spellEnd"/>
+      <w:r>
+        <w:rPr>
+          <w:rFonts w:eastAsia="Arial"/>
+          <w:i/>
+          <w:sz w:val="19"/>
+        </w:rPr>
+        <w:t xml:space="preserve">, </w:t>
+      </w:r>
+      <w:proofErr w:type="spellStart"/>
+      <w:r>
+        <w:rPr>
+          <w:rFonts w:eastAsia="Arial"/>
+          <w:i/>
+          <w:sz w:val="19"/>
+        </w:rPr>
+        <w:t>FastAPI</w:t>
+      </w:r>
+      <w:proofErr w:type="spellEnd"/>
     </w:p>
     <w:p>
       <w:pPr>
         <w:keepNext/>
+        <w:keepLines/>
         <w:numPr>
           <w:ilvl w:val="0"/>
           <w:numId w:val="1"/>
@@ -511,6 +836,7 @@
     <w:p>
       <w:pPr>
         <w:keepNext/>
+        <w:keepLines/>
         <w:numPr>
           <w:ilvl w:val="0"/>
           <w:numId w:val="1"/>
@@ -526,6 +852,7 @@
     </w:p>
     <w:p>
       <w:pPr>
+        <w:keepLines/>
         <w:numPr>
           <w:ilvl w:val="0"/>
           <w:numId w:val="1"/>
@@ -536,7 +863,21 @@
         <w:rPr>
           <w:rFonts w:eastAsia="Arial"/>
         </w:rPr>
-        <w:t>Developed an auditable FastAPI scoring service with automated tests for training, scoring, and policy logic.</w:t>
+        <w:t xml:space="preserve">Developed an auditable </w:t>
+      </w:r>
+      <w:proofErr w:type="spellStart"/>
+      <w:r>
+        <w:rPr>
+          <w:rFonts w:eastAsia="Arial"/>
+        </w:rPr>
+        <w:t>FastAPI</w:t>
+      </w:r>
+      <w:proofErr w:type="spellEnd"/>
+      <w:r>
+        <w:rPr>
+          <w:rFonts w:eastAsia="Arial"/>
+        </w:rPr>
+        <w:t xml:space="preserve"> scoring service with automated tests for training, scoring, and policy logic.</w:t>
       </w:r>
     </w:p>
     <w:p>
@@ -549,15 +890,20 @@
       </w:pPr>
     </w:p>
     <w:p>
+      <w:pPr>
+        <w:keepNext/>
+        <w:keepLines/>
+      </w:pPr>
       <w:r>
         <w:rPr>
           <w:rFonts w:eastAsia="Arial"/>
           <w:b/>
           <w:sz w:val="23"/>
         </w:rPr>
+        <w:lastRenderedPageBreak/>
         <w:t xml:space="preserve">Real-Time Transaction Fraud &amp; Risk Intelligence Platform | </w:t>
       </w:r>
-      <w:hyperlink r:id="rId10">
+      <w:hyperlink r:id="rId12">
         <w:r>
           <w:rPr>
             <w:rFonts w:eastAsia="Arial"/>
@@ -573,6 +919,7 @@
     <w:p>
       <w:pPr>
         <w:keepNext/>
+        <w:keepLines/>
         <w:spacing w:after="30"/>
       </w:pPr>
       <w:r>
@@ -590,12 +937,103 @@
           <w:i/>
           <w:sz w:val="19"/>
         </w:rPr>
-        <w:t>Python, XGBoost, LightGBM, SHAP, MLflow, FastAPI, Streamlit, Docker</w:t>
+        <w:t xml:space="preserve">Python, </w:t>
+      </w:r>
+      <w:proofErr w:type="spellStart"/>
+      <w:r>
+        <w:rPr>
+          <w:rFonts w:eastAsia="Arial"/>
+          <w:i/>
+          <w:sz w:val="19"/>
+        </w:rPr>
+        <w:t>XGBoost</w:t>
+      </w:r>
+      <w:proofErr w:type="spellEnd"/>
+      <w:r>
+        <w:rPr>
+          <w:rFonts w:eastAsia="Arial"/>
+          <w:i/>
+          <w:sz w:val="19"/>
+        </w:rPr>
+        <w:t xml:space="preserve">, </w:t>
+      </w:r>
+      <w:proofErr w:type="spellStart"/>
+      <w:r>
+        <w:rPr>
+          <w:rFonts w:eastAsia="Arial"/>
+          <w:i/>
+          <w:sz w:val="19"/>
+        </w:rPr>
+        <w:t>LightGBM</w:t>
+      </w:r>
+      <w:proofErr w:type="spellEnd"/>
+      <w:r>
+        <w:rPr>
+          <w:rFonts w:eastAsia="Arial"/>
+          <w:i/>
+          <w:sz w:val="19"/>
+        </w:rPr>
+        <w:t xml:space="preserve">, SHAP, </w:t>
+      </w:r>
+      <w:proofErr w:type="spellStart"/>
+      <w:r>
+        <w:rPr>
+          <w:rFonts w:eastAsia="Arial"/>
+          <w:i/>
+          <w:sz w:val="19"/>
+        </w:rPr>
+        <w:t>MLflow</w:t>
+      </w:r>
+      <w:proofErr w:type="spellEnd"/>
+      <w:r>
+        <w:rPr>
+          <w:rFonts w:eastAsia="Arial"/>
+          <w:i/>
+          <w:sz w:val="19"/>
+        </w:rPr>
+        <w:t xml:space="preserve">, </w:t>
+      </w:r>
+      <w:proofErr w:type="spellStart"/>
+      <w:r>
+        <w:rPr>
+          <w:rFonts w:eastAsia="Arial"/>
+          <w:i/>
+          <w:sz w:val="19"/>
+        </w:rPr>
+        <w:t>FastAPI</w:t>
+      </w:r>
+      <w:proofErr w:type="spellEnd"/>
+      <w:r>
+        <w:rPr>
+          <w:rFonts w:eastAsia="Arial"/>
+          <w:i/>
+          <w:sz w:val="19"/>
+        </w:rPr>
+        <w:t xml:space="preserve">, </w:t>
+      </w:r>
+      <w:proofErr w:type="spellStart"/>
+      <w:r>
+        <w:rPr>
+          <w:rFonts w:eastAsia="Arial"/>
+          <w:i/>
+          <w:sz w:val="19"/>
+        </w:rPr>
+        <w:t>Streamlit</w:t>
+      </w:r>
+      <w:proofErr w:type="spellEnd"/>
+      <w:r>
+        <w:rPr>
+          <w:rFonts w:eastAsia="Arial"/>
+          <w:i/>
+          <w:sz w:val="19"/>
+        </w:rPr>
+        <w:t>, Docker</w:t>
       </w:r>
     </w:p>
     <w:p>
       <w:pPr>
         <w:keepNext/>
+        <w:keepLines/>
         <w:numPr>
           <w:ilvl w:val="0"/>
           <w:numId w:val="1"/>
@@ -606,12 +1044,27 @@
         <w:rPr>
           <w:rFonts w:eastAsia="Arial"/>
         </w:rPr>
-        <w:t>Built an end-to-end fraud platform using a 50,000-row PaySim-format dataset and 18 behavioral features.</w:t>
+        <w:t xml:space="preserve">Built an end-to-end fraud platform using a 50,000-row </w:t>
+      </w:r>
+      <w:proofErr w:type="spellStart"/>
+      <w:r>
+        <w:rPr>
+          <w:rFonts w:eastAsia="Arial"/>
+        </w:rPr>
+        <w:t>PaySim</w:t>
+      </w:r>
+      <w:proofErr w:type="spellEnd"/>
+      <w:r>
+        <w:rPr>
+          <w:rFonts w:eastAsia="Arial"/>
+        </w:rPr>
+        <w:t>-format dataset and 18 behavioral features.</w:t>
       </w:r>
     </w:p>
     <w:p>
       <w:pPr>
         <w:keepNext/>
+        <w:keepLines/>
         <w:numPr>
           <w:ilvl w:val="0"/>
           <w:numId w:val="1"/>
@@ -627,6 +1080,7 @@
     </w:p>
     <w:p>
       <w:pPr>
+        <w:keepLines/>
         <w:numPr>
           <w:ilvl w:val="0"/>
           <w:numId w:val="1"/>
@@ -643,6 +1097,7 @@
     <w:p>
       <w:pPr>
         <w:keepNext/>
+        <w:keepLines/>
         <w:spacing w:before="60" w:after="20"/>
       </w:pPr>
       <w:r>
@@ -651,10 +1106,9 @@
           <w:b/>
           <w:sz w:val="23"/>
         </w:rPr>
-        <w:lastRenderedPageBreak/>
         <w:t xml:space="preserve">Self-Learning AI Agent | </w:t>
       </w:r>
-      <w:hyperlink r:id="rId11">
+      <w:hyperlink r:id="rId13">
         <w:r>
           <w:rPr>
             <w:rFonts w:eastAsia="Arial"/>
@@ -670,6 +1124,7 @@
     <w:p>
       <w:pPr>
         <w:keepNext/>
+        <w:keepLines/>
         <w:spacing w:after="30"/>
       </w:pPr>
       <w:r>
@@ -687,12 +1142,85 @@
           <w:i/>
           <w:sz w:val="19"/>
         </w:rPr>
-        <w:t>Python, FastAPI, Ollama, Qwen, Mem0, Qdrant, PostgreSQL, SQLAlchemy, Docker</w:t>
+        <w:t xml:space="preserve">Python, </w:t>
+      </w:r>
+      <w:proofErr w:type="spellStart"/>
+      <w:r>
+        <w:rPr>
+          <w:rFonts w:eastAsia="Arial"/>
+          <w:i/>
+          <w:sz w:val="19"/>
+        </w:rPr>
+        <w:t>FastAPI</w:t>
+      </w:r>
+      <w:proofErr w:type="spellEnd"/>
+      <w:r>
+        <w:rPr>
+          <w:rFonts w:eastAsia="Arial"/>
+          <w:i/>
+          <w:sz w:val="19"/>
+        </w:rPr>
+        <w:t xml:space="preserve">, </w:t>
+      </w:r>
+      <w:proofErr w:type="spellStart"/>
+      <w:r>
+        <w:rPr>
+          <w:rFonts w:eastAsia="Arial"/>
+          <w:i/>
+          <w:sz w:val="19"/>
+        </w:rPr>
+        <w:t>Ollama</w:t>
+      </w:r>
+      <w:proofErr w:type="spellEnd"/>
+      <w:r>
+        <w:rPr>
+          <w:rFonts w:eastAsia="Arial"/>
+          <w:i/>
+          <w:sz w:val="19"/>
+        </w:rPr>
+        <w:t xml:space="preserve">, Qwen, Mem0, </w:t>
+      </w:r>
+      <w:proofErr w:type="spellStart"/>
+      <w:r>
+        <w:rPr>
+          <w:rFonts w:eastAsia="Arial"/>
+          <w:i/>
+          <w:sz w:val="19"/>
+        </w:rPr>
+        <w:t>Qdrant</w:t>
+      </w:r>
+      <w:proofErr w:type="spellEnd"/>
+      <w:r>
+        <w:rPr>
+          <w:rFonts w:eastAsia="Arial"/>
+          <w:i/>
+          <w:sz w:val="19"/>
+        </w:rPr>
+        <w:t xml:space="preserve">, PostgreSQL, </w:t>
+      </w:r>
+      <w:proofErr w:type="spellStart"/>
+      <w:r>
+        <w:rPr>
+          <w:rFonts w:eastAsia="Arial"/>
+          <w:i/>
+          <w:sz w:val="19"/>
+        </w:rPr>
+        <w:t>SQLAlchemy</w:t>
+      </w:r>
+      <w:proofErr w:type="spellEnd"/>
+      <w:r>
+        <w:rPr>
+          <w:rFonts w:eastAsia="Arial"/>
+          <w:i/>
+          <w:sz w:val="19"/>
+        </w:rPr>
+        <w:t>, Docker</w:t>
       </w:r>
     </w:p>
     <w:p>
       <w:pPr>
         <w:keepNext/>
+        <w:keepLines/>
         <w:numPr>
           <w:ilvl w:val="0"/>
           <w:numId w:val="1"/>
@@ -708,6 +1236,7 @@
     </w:p>
     <w:p>
       <w:pPr>
+        <w:keepLines/>
         <w:numPr>
           <w:ilvl w:val="0"/>
           <w:numId w:val="1"/>
@@ -828,28 +1357,23 @@
           <w:rFonts w:eastAsia="Arial"/>
           <w:sz w:val="22"/>
         </w:rPr>
-        <w:t xml:space="preserve"> </w:t>
+        <w:t xml:space="preserve"> Advanced Certification in Data Science and AI from </w:t>
       </w:r>
+      <w:proofErr w:type="spellStart"/>
       <w:r>
         <w:rPr>
           <w:rFonts w:eastAsia="Arial"/>
           <w:sz w:val="22"/>
         </w:rPr>
-        <w:t>Advanced Certification in Data Science and AI</w:t>
+        <w:t>iHUB</w:t>
       </w:r>
+      <w:proofErr w:type="spellEnd"/>
       <w:r>
         <w:rPr>
           <w:rFonts w:eastAsia="Arial"/>
           <w:sz w:val="22"/>
         </w:rPr>
-        <w:t xml:space="preserve"> </w:t>
-      </w:r>
-      <w:r>
-        <w:rPr>
-          <w:rFonts w:eastAsia="Arial"/>
-          <w:sz w:val="22"/>
-        </w:rPr>
-        <w:t>from iHUB IIT Roorkee</w:t>
+        <w:t xml:space="preserve"> IIT Roorkee</w:t>
       </w:r>
       <w:r>
         <w:rPr>
@@ -959,7 +1483,21 @@
         <w:rPr>
           <w:rFonts w:eastAsia="Arial"/>
         </w:rPr>
-        <w:t>National Level Intercollegiate Hackazon, 2023</w:t>
+        <w:t xml:space="preserve">National Level Intercollegiate </w:t>
+      </w:r>
+      <w:proofErr w:type="spellStart"/>
+      <w:r>
+        <w:rPr>
+          <w:rFonts w:eastAsia="Arial"/>
+        </w:rPr>
+        <w:t>Hackazon</w:t>
+      </w:r>
+      <w:proofErr w:type="spellEnd"/>
+      <w:r>
+        <w:rPr>
+          <w:rFonts w:eastAsia="Arial"/>
+        </w:rPr>
+        <w:t>, 2023</w:t>
       </w:r>
     </w:p>
     <w:sectPr>
@@ -1774,6 +2312,7 @@
   <w:style w:type="character" w:default="1" w:styleId="DefaultParagraphFont">
     <w:name w:val="Default Paragraph Font"/>
     <w:uiPriority w:val="1"/>
+    <w:semiHidden/>
     <w:unhideWhenUsed/>
   </w:style>
   <w:style w:type="table" w:default="1" w:styleId="TableNormal">

</xml_diff>